<commit_message>
Upload weekly-report in week6
</commit_message>
<xml_diff>
--- a/docs/weekly-reports/week5/张景轩week5.docx
+++ b/docs/weekly-reports/week5/张景轩week5.docx
@@ -174,7 +174,7 @@
             <w:pPr>
               <w:jc w:val="center"/>
               <w:rPr>
-                <w:rFonts w:ascii="宋体" w:eastAsia="宋体" w:hAnsi="宋体" w:cs="宋体" w:hint="eastAsia"/>
+                <w:rFonts w:ascii="宋体" w:eastAsia="宋体" w:hAnsi="宋体" w:cs="宋体"/>
                 <w:color w:val="000000"/>
               </w:rPr>
             </w:pPr>
@@ -327,7 +327,15 @@
                 <w:color w:val="000000"/>
                 <w:lang w:bidi="ar"/>
               </w:rPr>
-              <w:t xml:space="preserve">  完成 SDD 总目录设计，初步确定整篇设计文档的整体结构。 </w:t>
+              <w:t xml:space="preserve">  </w:t>
+            </w:r>
+            <w:r>
+              <w:rPr>
+                <w:rFonts w:ascii="宋体" w:eastAsia="宋体" w:hAnsi="宋体" w:cs="宋体"/>
+                <w:color w:val="000000"/>
+                <w:lang w:bidi="ar"/>
+              </w:rPr>
+              <w:t xml:space="preserve">对已有的 SRS 文档进行了补充和完善。 </w:t>
             </w:r>
           </w:p>
           <w:p>
@@ -345,7 +353,7 @@
                 <w:color w:val="000000"/>
                 <w:lang w:bidi="ar"/>
               </w:rPr>
-              <w:t xml:space="preserve">  完成章节编号和统一格式规范，为后续多人协作编写提供统一标准。 </w:t>
+              <w:t xml:space="preserve">  对部分需求描述进行了进一步梳理，使内容表达更加清晰规范。 </w:t>
             </w:r>
           </w:p>
           <w:p>
@@ -363,7 +371,7 @@
                 <w:color w:val="000000"/>
                 <w:lang w:bidi="ar"/>
               </w:rPr>
-              <w:t xml:space="preserve">  完成第1、2、3章的初稿框架搭建，明确这些章节应包含的主要内容。 </w:t>
+              <w:t xml:space="preserve">  检查并调整了部分章节结构与表述方式，提高文档整体一致性。 </w:t>
             </w:r>
           </w:p>
           <w:p>
@@ -381,7 +389,7 @@
                 <w:color w:val="000000"/>
                 <w:lang w:bidi="ar"/>
               </w:rPr>
-              <w:t xml:space="preserve">  明确各成员负责的章节内容与交付要求，进一步落实分工。 </w:t>
+              <w:t xml:space="preserve">  初步完成了从需求阶段向设计阶段的衔接准备。 </w:t>
             </w:r>
           </w:p>
           <w:p>
@@ -399,25 +407,25 @@
                 <w:color w:val="000000"/>
                 <w:lang w:bidi="ar"/>
               </w:rPr>
-              <w:t xml:space="preserve">  给出全文术语统一表，对关键概念、模块名称和常用表述进行了规范。 </w:t>
+              <w:t>  开展了 SDD 文档编写的分工安排，明确后续各成员需要负责的设计内容方向。</w:t>
             </w:r>
           </w:p>
           <w:p>
             <w:pPr>
               <w:textAlignment w:val="top"/>
               <w:rPr>
+                <w:rFonts w:ascii="宋体" w:eastAsia="宋体" w:hAnsi="宋体" w:cs="宋体"/>
+                <w:color w:val="000000"/>
+                <w:lang w:bidi="ar"/>
+              </w:rPr>
+            </w:pPr>
+            <w:r>
+              <w:rPr>
                 <w:rFonts w:ascii="宋体" w:eastAsia="宋体" w:hAnsi="宋体" w:cs="宋体" w:hint="eastAsia"/>
                 <w:color w:val="000000"/>
                 <w:lang w:bidi="ar"/>
               </w:rPr>
-            </w:pPr>
-            <w:r>
-              <w:rPr>
-                <w:rFonts w:ascii="宋体" w:eastAsia="宋体" w:hAnsi="宋体" w:cs="宋体"/>
-                <w:color w:val="000000"/>
-                <w:lang w:bidi="ar"/>
-              </w:rPr>
-              <w:t>  为后续系统结构设计、模块设计和详细设计部分的展开打下基础。</w:t>
+              <w:t>未完成的内容：</w:t>
             </w:r>
           </w:p>
           <w:p>
@@ -431,11 +439,19 @@
             </w:pPr>
             <w:r>
               <w:rPr>
-                <w:rFonts w:ascii="宋体" w:eastAsia="宋体" w:hAnsi="宋体" w:cs="宋体" w:hint="eastAsia"/>
-                <w:color w:val="000000"/>
-                <w:lang w:bidi="ar"/>
-              </w:rPr>
-              <w:t>未完成的内容：</w:t>
+                <w:rFonts w:ascii="宋体" w:eastAsia="宋体" w:hAnsi="宋体" w:cs="宋体"/>
+                <w:color w:val="000000"/>
+                <w:lang w:bidi="ar"/>
+              </w:rPr>
+              <w:t xml:space="preserve">  </w:t>
+            </w:r>
+            <w:r>
+              <w:rPr>
+                <w:rFonts w:ascii="宋体" w:eastAsia="宋体" w:hAnsi="宋体" w:cs="宋体"/>
+                <w:color w:val="000000"/>
+                <w:lang w:bidi="ar"/>
+              </w:rPr>
+              <w:t xml:space="preserve">SRS 虽已进一步完善，但仍可继续优化个别细节表述。 </w:t>
             </w:r>
           </w:p>
           <w:p>
@@ -453,7 +469,7 @@
                 <w:color w:val="000000"/>
                 <w:lang w:bidi="ar"/>
               </w:rPr>
-              <w:t xml:space="preserve">  SDD 各章节的详细正文内容尚未全部完成。 </w:t>
+              <w:t xml:space="preserve">  SDD 文档的整体目录、格式和章节框架尚未正式完成。 </w:t>
             </w:r>
           </w:p>
           <w:p>
@@ -471,25 +487,7 @@
                 <w:color w:val="000000"/>
                 <w:lang w:bidi="ar"/>
               </w:rPr>
-              <w:t xml:space="preserve">  当前完成的第1、2、3章仍主要是框架层面，后续还需要补充完整内容。 </w:t>
-            </w:r>
-          </w:p>
-          <w:p>
-            <w:pPr>
-              <w:textAlignment w:val="top"/>
-              <w:rPr>
-                <w:rFonts w:ascii="宋体" w:eastAsia="宋体" w:hAnsi="宋体" w:cs="宋体" w:hint="eastAsia"/>
-                <w:color w:val="000000"/>
-                <w:lang w:bidi="ar"/>
-              </w:rPr>
-            </w:pPr>
-            <w:r>
-              <w:rPr>
-                <w:rFonts w:ascii="宋体" w:eastAsia="宋体" w:hAnsi="宋体" w:cs="宋体"/>
-                <w:color w:val="000000"/>
-                <w:lang w:bidi="ar"/>
-              </w:rPr>
-              <w:t>  各成员负责章节尚处于准备和起草阶段，整体文档尚未整合成完整版本。</w:t>
+              <w:t>  各成员负责部分尚未进入大规模正文撰写阶段。</w:t>
             </w:r>
           </w:p>
         </w:tc>
@@ -614,7 +612,14 @@
                 <w:rFonts w:ascii="宋体" w:eastAsia="宋体" w:hAnsi="宋体" w:cs="宋体"/>
                 <w:color w:val="000000"/>
               </w:rPr>
-              <w:t xml:space="preserve">  虽然已经建立了统一格式和术语规范，但后续多人协作时仍可能出现风格不一致的问题。 </w:t>
+              <w:t xml:space="preserve">  </w:t>
+            </w:r>
+            <w:r>
+              <w:rPr>
+                <w:rFonts w:ascii="宋体" w:eastAsia="宋体" w:hAnsi="宋体" w:cs="宋体"/>
+                <w:color w:val="000000"/>
+              </w:rPr>
+              <w:t xml:space="preserve">SRS 中个别需求仍然较为概括，后续转化为系统设计时还需进一步细化。 </w:t>
             </w:r>
           </w:p>
           <w:p>
@@ -630,23 +635,23 @@
                 <w:rFonts w:ascii="宋体" w:eastAsia="宋体" w:hAnsi="宋体" w:cs="宋体"/>
                 <w:color w:val="000000"/>
               </w:rPr>
-              <w:t xml:space="preserve">  部分章节之间的衔接方式和内容边界还需在编写过程中继续调整。 </w:t>
+              <w:t xml:space="preserve">  需求与设计之间的边界需要在下一阶段继续明确，避免文档内容重叠。 </w:t>
             </w:r>
           </w:p>
           <w:p>
             <w:pPr>
               <w:textAlignment w:val="top"/>
               <w:rPr>
-                <w:rFonts w:ascii="宋体" w:eastAsia="宋体" w:hAnsi="宋体" w:cs="宋体"/>
-                <w:color w:val="000000"/>
-              </w:rPr>
-            </w:pPr>
-            <w:r>
-              <w:rPr>
-                <w:rFonts w:ascii="宋体" w:eastAsia="宋体" w:hAnsi="宋体" w:cs="宋体"/>
-                <w:color w:val="000000"/>
-              </w:rPr>
-              <w:t>  当前文档更多是框架搭建，真正的系统设计细节仍需逐步充实。</w:t>
+                <w:rFonts w:ascii="宋体" w:eastAsia="宋体" w:hAnsi="宋体" w:cs="宋体" w:hint="eastAsia"/>
+                <w:color w:val="000000"/>
+              </w:rPr>
+            </w:pPr>
+            <w:r>
+              <w:rPr>
+                <w:rFonts w:ascii="宋体" w:eastAsia="宋体" w:hAnsi="宋体" w:cs="宋体"/>
+                <w:color w:val="000000"/>
+              </w:rPr>
+              <w:t>  虽然已完成 SDD 分工，但文档编写标准和结构规范还未完全统一。</w:t>
             </w:r>
           </w:p>
         </w:tc>
@@ -773,7 +778,15 @@
                 <w:color w:val="000000"/>
                 <w:lang w:bidi="ar"/>
               </w:rPr>
-              <w:t xml:space="preserve">  后续应严格按照既定目录、编号和术语表进行撰写，减少整合时的重复修改工作。 </w:t>
+              <w:t xml:space="preserve">  </w:t>
+            </w:r>
+            <w:r>
+              <w:rPr>
+                <w:rFonts w:ascii="宋体" w:eastAsia="宋体" w:hAnsi="宋体" w:cs="宋体"/>
+                <w:color w:val="000000"/>
+                <w:lang w:bidi="ar"/>
+              </w:rPr>
+              <w:t xml:space="preserve">在进入 SDD 编写前，应先统一设计文档的目录结构、格式规范和术语使用。 </w:t>
             </w:r>
           </w:p>
           <w:p>
@@ -791,7 +804,7 @@
                 <w:color w:val="000000"/>
                 <w:lang w:bidi="ar"/>
               </w:rPr>
-              <w:t xml:space="preserve">  项目经理应持续检查各成员文档进度和规范执行情况，确保整体风格统一。 </w:t>
+              <w:t xml:space="preserve">  后续设计工作应严格以完善后的 SRS 为依据，保持需求与设计的一致性。 </w:t>
             </w:r>
           </w:p>
           <w:p>
@@ -809,25 +822,7 @@
                 <w:color w:val="000000"/>
                 <w:lang w:bidi="ar"/>
               </w:rPr>
-              <w:t xml:space="preserve">  在后续章节编写时要注意与 SRS 保持一致，避免出现设计内容与需求描述脱节的情况。 </w:t>
-            </w:r>
-          </w:p>
-          <w:p>
-            <w:pPr>
-              <w:textAlignment w:val="top"/>
-              <w:rPr>
-                <w:rFonts w:ascii="宋体" w:eastAsia="宋体" w:hAnsi="宋体" w:cs="宋体"/>
-                <w:color w:val="000000"/>
-                <w:lang w:bidi="ar"/>
-              </w:rPr>
-            </w:pPr>
-            <w:r>
-              <w:rPr>
-                <w:rFonts w:ascii="宋体" w:eastAsia="宋体" w:hAnsi="宋体" w:cs="宋体"/>
-                <w:color w:val="000000"/>
-                <w:lang w:bidi="ar"/>
-              </w:rPr>
-              <w:t>  对于系统核心模块，应尽早明确模块边界、接口关系和数据流转逻辑，提升后续设计质量。</w:t>
+              <w:t>  项目经理应继续加强组织与统筹，保证各成员后续提交内容在结构和表达上保持统一。</w:t>
             </w:r>
           </w:p>
         </w:tc>
@@ -1042,7 +1037,7 @@
                 <w:color w:val="000000"/>
                 <w:lang w:bidi="ar"/>
               </w:rPr>
-              <w:t>下周计划在现有 SDD 框架基础上，继续推进各章节正文撰写，重点完善系统总体设计、模块划分、接口设计及数据结构等内容，并逐步形成可整合的设计文档初稿。</w:t>
+              <w:t>下周计划正式推进 SDD 文档编写工作，完成 SDD 总目录、章节编号和统一格式设计，搭建前几章初稿框架，并进一步明确各成员的具体交付要求和术语规范。</w:t>
             </w:r>
           </w:p>
         </w:tc>

</xml_diff>